<commit_message>
added , in 5th service
</commit_message>
<xml_diff>
--- a/facility.docx
+++ b/facility.docx
@@ -185,8 +185,51 @@
       </w:r>
     </w:p>
     <w:p>
+      <w:pPr>
+        <w:rPr>
+          <w:lang w:val="en-US"/>
+        </w:rPr>
+      </w:pPr>
       <w:r>
         <w:t>5.Facilitation d‘achat</w:t>
+      </w:r>
+      <w:r>
+        <w:rPr>
+          <w:lang w:val="en-US"/>
+        </w:rPr>
+        <w:br/>
+      </w:r>
+      <w:r>
+        <w:rPr>
+          <w:lang w:val="en-US"/>
+        </w:rPr>
+        <w:br/>
+      </w:r>
+      <w:r>
+        <w:rPr>
+          <w:lang w:val="en-US"/>
+        </w:rPr>
+        <w:br/>
+        <w:t>section to hav</w:t>
+      </w:r>
+      <w:r>
+        <w:rPr>
+          <w:lang w:val="en-US"/>
+        </w:rPr>
+        <w:t>e:</w:t>
+      </w:r>
+    </w:p>
+    <w:p>
+      <w:pPr>
+        <w:rPr>
+          <w:lang w:val="en-US"/>
+        </w:rPr>
+      </w:pPr>
+      <w:r>
+        <w:rPr>
+          <w:lang w:val="en-US"/>
+        </w:rPr>
+        <w:t xml:space="preserve">First one a </w:t>
       </w:r>
     </w:p>
     <w:sectPr>

</xml_diff>